<commit_message>
feat: add admin governance and trend moderation
</commit_message>
<xml_diff>
--- a/docx/基于大模型的智能穿搭推荐系统_毕业设计成果_数据库部分完成.docx
+++ b/docx/基于大模型的智能穿搭推荐系统_毕业设计成果_数据库部分完成.docx
@@ -442,6 +442,12 @@
             </w:pPr>
             <w:r>
               <w:t>软件技术</w:t>
+            </w:r>
+            <w:r>
+              <w:rPr>
+                <w:rFonts w:hint="eastAsia"/>
+              </w:rPr>
+              <w:t>（企业应用软件开发方向）</w:t>
             </w:r>
           </w:p>
         </w:tc>
@@ -11474,7 +11480,7 @@
           <w:lang w:val="ru-RU"/>
         </w:rPr>
         <w:drawing>
-          <wp:inline distT="0" distB="0" distL="0" distR="0" wp14:anchorId="7C459774" wp14:editId="445E7D8A">
+          <wp:inline distT="0" distB="0" distL="0" distR="0" wp14:anchorId="7C459774" wp14:editId="36137A10">
             <wp:extent cx="5760720" cy="4127618"/>
             <wp:effectExtent l="0" t="0" r="0" b="6350"/>
             <wp:docPr id="1521137013" name="图片 1"/>
@@ -11573,7 +11579,7 @@
         </w:rPr>
         <w:lastRenderedPageBreak/>
         <w:drawing>
-          <wp:inline distT="0" distB="0" distL="0" distR="0" wp14:anchorId="35EA2991" wp14:editId="22C03FDB">
+          <wp:inline distT="0" distB="0" distL="0" distR="0" wp14:anchorId="35EA2991" wp14:editId="2FF3C684">
             <wp:extent cx="5760720" cy="3822680"/>
             <wp:effectExtent l="0" t="0" r="0" b="6985"/>
             <wp:docPr id="1141785506" name="图片 2"/>
@@ -19477,7 +19483,7 @@
         </w:rPr>
         <w:lastRenderedPageBreak/>
         <w:drawing>
-          <wp:inline distT="0" distB="0" distL="114300" distR="114300" wp14:anchorId="1AB8E045" wp14:editId="4444E98B">
+          <wp:inline distT="0" distB="0" distL="114300" distR="114300" wp14:anchorId="1AB8E045" wp14:editId="768D90AA">
             <wp:extent cx="5764696" cy="3551465"/>
             <wp:effectExtent l="0" t="0" r="7620" b="0"/>
             <wp:docPr id="10" name="图片 1"/>

</xml_diff>